<commit_message>
Added Application template(gr), automatic date, +extras in messages
</commit_message>
<xml_diff>
--- a/templates/ΑΙΤΗΣΗ_doc.docx
+++ b/templates/ΑΙΤΗΣΗ_doc.docx
@@ -97,21 +97,21 @@
       </w:r>
       <w:r>
         <w:rPr>
-          <w:lang w:val="el-GR"/>
-        </w:rPr>
-        <w:t xml:space="preserve"> </w:t>
-      </w:r>
-      <w:r>
-        <w:rPr>
-          <w:lang w:val="el-GR"/>
-        </w:rPr>
-        <w:t>επώνυμο</w:t>
-      </w:r>
-      <w:r>
-        <w:rPr>
-          <w:lang w:val="el-GR"/>
-        </w:rPr>
-        <w:t xml:space="preserve"> </w:t>
+          <w:lang w:val="en-US"/>
+        </w:rPr>
+        <w:t>last</w:t>
+      </w:r>
+      <w:r>
+        <w:rPr>
+          <w:lang w:val="el-GR"/>
+        </w:rPr>
+        <w:t>_</w:t>
+      </w:r>
+      <w:r>
+        <w:rPr>
+          <w:lang w:val="en-US"/>
+        </w:rPr>
+        <w:t>name</w:t>
       </w:r>
       <w:r>
         <w:rPr>
@@ -146,21 +146,9 @@
       </w:r>
       <w:r>
         <w:rPr>
-          <w:lang w:val="el-GR"/>
-        </w:rPr>
-        <w:t xml:space="preserve"> </w:t>
-      </w:r>
-      <w:r>
-        <w:rPr>
-          <w:lang w:val="el-GR"/>
-        </w:rPr>
-        <w:t>όνομα</w:t>
-      </w:r>
-      <w:r>
-        <w:rPr>
-          <w:lang w:val="el-GR"/>
-        </w:rPr>
-        <w:t xml:space="preserve"> </w:t>
+          <w:lang w:val="en-US"/>
+        </w:rPr>
+        <w:t>name</w:t>
       </w:r>
       <w:r>
         <w:rPr>
@@ -201,16 +189,9 @@
       </w:r>
       <w:r>
         <w:rPr>
-          <w:lang w:val="el-GR"/>
-        </w:rPr>
-        <w:t xml:space="preserve"> </w:t>
-      </w:r>
-      <w:proofErr w:type="spellStart"/>
-      <w:r>
-        <w:rPr>
-          <w:lang w:val="el-GR"/>
-        </w:rPr>
-        <w:t>όνομα</w:t>
+          <w:lang w:val="en-US"/>
+        </w:rPr>
+        <w:t>fathers</w:t>
       </w:r>
       <w:r>
         <w:rPr>
@@ -220,16 +201,9 @@
       </w:r>
       <w:r>
         <w:rPr>
-          <w:lang w:val="el-GR"/>
-        </w:rPr>
-        <w:t>πατρός</w:t>
-      </w:r>
-      <w:proofErr w:type="spellEnd"/>
-      <w:r>
-        <w:rPr>
-          <w:lang w:val="el-GR"/>
-        </w:rPr>
-        <w:t xml:space="preserve"> </w:t>
+          <w:lang w:val="en-US"/>
+        </w:rPr>
+        <w:t>name</w:t>
       </w:r>
       <w:r>
         <w:rPr>
@@ -266,16 +240,342 @@
       </w:r>
       <w:r>
         <w:rPr>
-          <w:lang w:val="el-GR"/>
-        </w:rPr>
+          <w:lang w:val="en-US"/>
+        </w:rPr>
+        <w:t>mothers</w:t>
+      </w:r>
+      <w:r>
+        <w:rPr>
+          <w:lang w:val="el-GR"/>
+        </w:rPr>
+        <w:t>_</w:t>
+      </w:r>
+      <w:r>
+        <w:rPr>
+          <w:lang w:val="en-US"/>
+        </w:rPr>
+        <w:t>name</w:t>
+      </w:r>
+      <w:r>
+        <w:rPr>
+          <w:lang w:val="el-GR"/>
+        </w:rPr>
+        <w:t>}</w:t>
+      </w:r>
+      <w:r>
+        <w:rPr>
+          <w:lang w:val="el-GR"/>
+        </w:rPr>
+        <w:t>}</w:t>
+      </w:r>
+    </w:p>
+    <w:p>
+      <w:r>
+        <w:rPr>
+          <w:lang w:val="el-GR"/>
+        </w:rPr>
+        <w:t>Α</w:t>
+      </w:r>
+      <w:r>
+        <w:t>.</w:t>
+      </w:r>
+      <w:r>
+        <w:rPr>
+          <w:lang w:val="el-GR"/>
+        </w:rPr>
+        <w:t>Μ</w:t>
+      </w:r>
+      <w:r>
+        <w:t>.</w:t>
+      </w:r>
+      <w:r>
+        <w:rPr>
+          <w:lang w:val="el-GR"/>
+        </w:rPr>
+        <w:t>Τ</w:t>
+      </w:r>
+      <w:r>
+        <w:t>: {</w:t>
+      </w:r>
+      <w:r>
+        <w:t>{</w:t>
+      </w:r>
+      <w:r>
+        <w:t>university_</w:t>
+      </w:r>
+      <w:proofErr w:type="spellStart"/>
+      <w:r>
+        <w:rPr>
+          <w:lang w:val="en-US"/>
+        </w:rPr>
+        <w:t>registration_number</w:t>
+      </w:r>
+      <w:proofErr w:type="spellEnd"/>
+      <w:r>
+        <w:t>}</w:t>
+      </w:r>
+      <w:r>
+        <w:t>}</w:t>
+      </w:r>
+    </w:p>
+    <w:p>
+      <w:pPr>
+        <w:rPr>
+          <w:lang w:val="el-GR"/>
+        </w:rPr>
+      </w:pPr>
+      <w:r>
+        <w:rPr>
+          <w:lang w:val="el-GR"/>
+        </w:rPr>
+        <w:t>Εξάμηνο: {</w:t>
+      </w:r>
+      <w:r>
+        <w:rPr>
+          <w:lang w:val="el-GR"/>
+        </w:rPr>
+        <w:t>{</w:t>
+      </w:r>
+      <w:r>
+        <w:rPr>
+          <w:lang w:val="en-US"/>
+        </w:rPr>
+        <w:t>semester</w:t>
+      </w:r>
+      <w:r>
+        <w:rPr>
+          <w:lang w:val="el-GR"/>
+        </w:rPr>
+        <w:t>}</w:t>
+      </w:r>
+      <w:r>
+        <w:rPr>
+          <w:lang w:val="el-GR"/>
+        </w:rPr>
+        <w:t>}</w:t>
+      </w:r>
+    </w:p>
+    <w:p>
+      <w:pPr>
+        <w:rPr>
+          <w:lang w:val="el-GR"/>
+        </w:rPr>
+      </w:pPr>
+    </w:p>
+    <w:p>
+      <w:pPr>
+        <w:rPr>
+          <w:lang w:val="el-GR"/>
+        </w:rPr>
+      </w:pPr>
+      <w:r>
+        <w:rPr>
+          <w:lang w:val="el-GR"/>
+        </w:rPr>
+        <w:t>Διεύθυνση κατοικίας:</w:t>
+      </w:r>
+    </w:p>
+    <w:p>
+      <w:r>
+        <w:rPr>
+          <w:lang w:val="el-GR"/>
+        </w:rPr>
+        <w:t>Οδός</w:t>
+      </w:r>
+      <w:r>
+        <w:t>: {</w:t>
+      </w:r>
+      <w:r>
+        <w:t>{</w:t>
+      </w:r>
+      <w:proofErr w:type="spellStart"/>
+      <w:r>
+        <w:rPr>
+          <w:lang w:val="en-US"/>
+        </w:rPr>
+        <w:t>street_name</w:t>
+      </w:r>
+      <w:proofErr w:type="spellEnd"/>
+      <w:r>
         <w:t xml:space="preserve"> </w:t>
       </w:r>
+      <w:r>
+        <w:t>}</w:t>
+      </w:r>
+      <w:r>
+        <w:t>}</w:t>
+      </w:r>
+    </w:p>
+    <w:p>
+      <w:r>
+        <w:rPr>
+          <w:lang w:val="el-GR"/>
+        </w:rPr>
+        <w:t>Αριθμός</w:t>
+      </w:r>
+      <w:r>
+        <w:t>: {</w:t>
+      </w:r>
+      <w:r>
+        <w:t>{</w:t>
+      </w:r>
       <w:proofErr w:type="spellStart"/>
       <w:r>
         <w:rPr>
-          <w:lang w:val="el-GR"/>
-        </w:rPr>
-        <w:t>όνομα</w:t>
+          <w:lang w:val="en-US"/>
+        </w:rPr>
+        <w:t>street_number</w:t>
+      </w:r>
+      <w:proofErr w:type="spellEnd"/>
+      <w:r>
+        <w:t>}</w:t>
+      </w:r>
+      <w:r>
+        <w:t>}</w:t>
+      </w:r>
+    </w:p>
+    <w:p>
+      <w:pPr>
+        <w:rPr>
+          <w:lang w:val="el-GR"/>
+        </w:rPr>
+      </w:pPr>
+      <w:r>
+        <w:rPr>
+          <w:lang w:val="el-GR"/>
+        </w:rPr>
+        <w:t>Τ.Κ: {</w:t>
+      </w:r>
+      <w:r>
+        <w:rPr>
+          <w:lang w:val="el-GR"/>
+        </w:rPr>
+        <w:t>{</w:t>
+      </w:r>
+      <w:proofErr w:type="spellStart"/>
+      <w:r>
+        <w:rPr>
+          <w:lang w:val="en-US"/>
+        </w:rPr>
+        <w:t>postal_code</w:t>
+      </w:r>
+      <w:proofErr w:type="spellEnd"/>
+      <w:r>
+        <w:rPr>
+          <w:lang w:val="el-GR"/>
+        </w:rPr>
+        <w:t>}</w:t>
+      </w:r>
+      <w:r>
+        <w:rPr>
+          <w:lang w:val="el-GR"/>
+        </w:rPr>
+        <w:t>}</w:t>
+      </w:r>
+    </w:p>
+    <w:p>
+      <w:pPr>
+        <w:rPr>
+          <w:lang w:val="el-GR"/>
+        </w:rPr>
+      </w:pPr>
+      <w:r>
+        <w:rPr>
+          <w:lang w:val="el-GR"/>
+        </w:rPr>
+        <w:t>Πόλη: {</w:t>
+      </w:r>
+      <w:r>
+        <w:rPr>
+          <w:lang w:val="el-GR"/>
+        </w:rPr>
+        <w:t>{</w:t>
+      </w:r>
+      <w:r>
+        <w:rPr>
+          <w:lang w:val="en-US"/>
+        </w:rPr>
+        <w:t>city</w:t>
+      </w:r>
+      <w:r>
+        <w:rPr>
+          <w:lang w:val="el-GR"/>
+        </w:rPr>
+        <w:t>}</w:t>
+      </w:r>
+      <w:r>
+        <w:rPr>
+          <w:lang w:val="el-GR"/>
+        </w:rPr>
+        <w:t>}</w:t>
+      </w:r>
+    </w:p>
+    <w:p>
+      <w:pPr>
+        <w:rPr>
+          <w:lang w:val="el-GR"/>
+        </w:rPr>
+      </w:pPr>
+      <w:r>
+        <w:rPr>
+          <w:lang w:val="el-GR"/>
+        </w:rPr>
+        <w:t>Τηλέφωνο: {</w:t>
+      </w:r>
+      <w:r>
+        <w:rPr>
+          <w:lang w:val="el-GR"/>
+        </w:rPr>
+        <w:t>{</w:t>
+      </w:r>
+      <w:r>
+        <w:rPr>
+          <w:lang w:val="en-US"/>
+        </w:rPr>
+        <w:t>phone</w:t>
+      </w:r>
+      <w:r>
+        <w:rPr>
+          <w:lang w:val="el-GR"/>
+        </w:rPr>
+        <w:t>}</w:t>
+      </w:r>
+      <w:r>
+        <w:rPr>
+          <w:lang w:val="el-GR"/>
+        </w:rPr>
+        <w:t>}</w:t>
+      </w:r>
+    </w:p>
+    <w:p>
+      <w:pPr>
+        <w:rPr>
+          <w:lang w:val="el-GR"/>
+        </w:rPr>
+      </w:pPr>
+      <w:r>
+        <w:rPr>
+          <w:lang w:val="el-GR"/>
+        </w:rPr>
+        <w:t xml:space="preserve">Κινητό: </w:t>
+      </w:r>
+      <w:r>
+        <w:rPr>
+          <w:lang w:val="el-GR"/>
+        </w:rPr>
+        <w:t>{</w:t>
+      </w:r>
+      <w:r>
+        <w:rPr>
+          <w:lang w:val="el-GR"/>
+        </w:rPr>
+        <w:t>{</w:t>
+      </w:r>
+      <w:r>
+        <w:rPr>
+          <w:lang w:val="en-US"/>
+        </w:rPr>
+        <w:t>mobile</w:t>
       </w:r>
       <w:r>
         <w:rPr>
@@ -285,41 +585,41 @@
       </w:r>
       <w:r>
         <w:rPr>
-          <w:lang w:val="el-GR"/>
-        </w:rPr>
-        <w:t>μητρός</w:t>
-      </w:r>
-      <w:proofErr w:type="spellEnd"/>
-      <w:r>
-        <w:rPr>
-          <w:lang w:val="el-GR"/>
-        </w:rPr>
-        <w:t xml:space="preserve"> </w:t>
-      </w:r>
-      <w:r>
-        <w:rPr>
-          <w:lang w:val="el-GR"/>
-        </w:rPr>
-        <w:t>}</w:t>
-      </w:r>
-      <w:r>
-        <w:rPr>
-          <w:lang w:val="el-GR"/>
-        </w:rPr>
-        <w:t>}</w:t>
-      </w:r>
-    </w:p>
-    <w:p>
-      <w:pPr>
-        <w:rPr>
-          <w:lang w:val="el-GR"/>
-        </w:rPr>
-      </w:pPr>
-      <w:r>
-        <w:rPr>
-          <w:lang w:val="el-GR"/>
-        </w:rPr>
-        <w:t>Α.Μ.Τ: {</w:t>
+          <w:lang w:val="en-US"/>
+        </w:rPr>
+        <w:t>phone</w:t>
+      </w:r>
+      <w:r>
+        <w:rPr>
+          <w:lang w:val="el-GR"/>
+        </w:rPr>
+        <w:t>}</w:t>
+      </w:r>
+      <w:r>
+        <w:rPr>
+          <w:lang w:val="el-GR"/>
+        </w:rPr>
+        <w:t>}</w:t>
+      </w:r>
+    </w:p>
+    <w:p>
+      <w:pPr>
+        <w:rPr>
+          <w:lang w:val="el-GR"/>
+        </w:rPr>
+      </w:pPr>
+    </w:p>
+    <w:p>
+      <w:pPr>
+        <w:rPr>
+          <w:lang w:val="el-GR"/>
+        </w:rPr>
+      </w:pPr>
+      <w:r>
+        <w:rPr>
+          <w:lang w:val="el-GR"/>
+        </w:rPr>
+        <w:t>Λαμία {</w:t>
       </w:r>
       <w:r>
         <w:rPr>
@@ -329,60 +629,21 @@
       </w:r>
       <w:r>
         <w:rPr>
-          <w:lang w:val="el-GR"/>
-        </w:rPr>
-        <w:t xml:space="preserve"> </w:t>
-      </w:r>
-      <w:proofErr w:type="spellStart"/>
-      <w:r>
-        <w:rPr>
-          <w:lang w:val="el-GR"/>
-        </w:rPr>
-        <w:t>αριθμός</w:t>
-      </w:r>
-      <w:r>
-        <w:rPr>
-          <w:lang w:val="el-GR"/>
-        </w:rPr>
-        <w:t>_</w:t>
-      </w:r>
-      <w:r>
-        <w:rPr>
-          <w:lang w:val="el-GR"/>
-        </w:rPr>
-        <w:t>μητρώου</w:t>
-      </w:r>
-      <w:proofErr w:type="spellEnd"/>
-      <w:r>
-        <w:rPr>
-          <w:lang w:val="el-GR"/>
-        </w:rPr>
-        <w:t xml:space="preserve"> </w:t>
-      </w:r>
-      <w:r>
-        <w:rPr>
-          <w:lang w:val="el-GR"/>
-        </w:rPr>
-        <w:t>}</w:t>
-      </w:r>
-      <w:r>
-        <w:rPr>
-          <w:lang w:val="el-GR"/>
-        </w:rPr>
-        <w:t>}</w:t>
-      </w:r>
-    </w:p>
-    <w:p>
-      <w:pPr>
-        <w:rPr>
-          <w:lang w:val="el-GR"/>
-        </w:rPr>
-      </w:pPr>
-      <w:r>
-        <w:rPr>
-          <w:lang w:val="el-GR"/>
-        </w:rPr>
-        <w:t>Εξάμηνο: {</w:t>
+          <w:lang w:val="en-US"/>
+        </w:rPr>
+        <w:t>day</w:t>
+      </w:r>
+      <w:r>
+        <w:rPr>
+          <w:lang w:val="el-GR"/>
+        </w:rPr>
+        <w:t>}</w:t>
+      </w:r>
+      <w:r>
+        <w:rPr>
+          <w:lang w:val="el-GR"/>
+        </w:rPr>
+        <w:t>}/{</w:t>
       </w:r>
       <w:r>
         <w:rPr>
@@ -392,66 +653,21 @@
       </w:r>
       <w:r>
         <w:rPr>
-          <w:lang w:val="el-GR"/>
-        </w:rPr>
-        <w:t xml:space="preserve"> </w:t>
-      </w:r>
-      <w:r>
-        <w:rPr>
-          <w:lang w:val="el-GR"/>
-        </w:rPr>
-        <w:t>εξάμηνο</w:t>
-      </w:r>
-      <w:r>
-        <w:rPr>
-          <w:lang w:val="el-GR"/>
-        </w:rPr>
-        <w:t xml:space="preserve"> </w:t>
-      </w:r>
-      <w:r>
-        <w:rPr>
-          <w:lang w:val="el-GR"/>
-        </w:rPr>
-        <w:t>}</w:t>
-      </w:r>
-      <w:r>
-        <w:rPr>
-          <w:lang w:val="el-GR"/>
-        </w:rPr>
-        <w:t>}</w:t>
-      </w:r>
-    </w:p>
-    <w:p>
-      <w:pPr>
-        <w:rPr>
-          <w:lang w:val="el-GR"/>
-        </w:rPr>
-      </w:pPr>
-    </w:p>
-    <w:p>
-      <w:pPr>
-        <w:rPr>
-          <w:lang w:val="el-GR"/>
-        </w:rPr>
-      </w:pPr>
-      <w:r>
-        <w:rPr>
-          <w:lang w:val="el-GR"/>
-        </w:rPr>
-        <w:t>Διεύθυνση κατοικίας:</w:t>
-      </w:r>
-    </w:p>
-    <w:p>
-      <w:pPr>
-        <w:rPr>
-          <w:lang w:val="el-GR"/>
-        </w:rPr>
-      </w:pPr>
-      <w:r>
-        <w:rPr>
-          <w:lang w:val="el-GR"/>
-        </w:rPr>
-        <w:t>Οδός: {</w:t>
+          <w:lang w:val="en-US"/>
+        </w:rPr>
+        <w:t>month</w:t>
+      </w:r>
+      <w:r>
+        <w:rPr>
+          <w:lang w:val="el-GR"/>
+        </w:rPr>
+        <w:t>}</w:t>
+      </w:r>
+      <w:r>
+        <w:rPr>
+          <w:lang w:val="el-GR"/>
+        </w:rPr>
+        <w:t>}/{</w:t>
       </w:r>
       <w:r>
         <w:rPr>
@@ -461,414 +677,9 @@
       </w:r>
       <w:r>
         <w:rPr>
-          <w:lang w:val="el-GR"/>
-        </w:rPr>
-        <w:t xml:space="preserve"> </w:t>
-      </w:r>
-      <w:r>
-        <w:rPr>
-          <w:lang w:val="el-GR"/>
-        </w:rPr>
-        <w:t>οδό</w:t>
-      </w:r>
-      <w:r>
-        <w:rPr>
-          <w:lang w:val="el-GR"/>
-        </w:rPr>
-        <w:t xml:space="preserve"> </w:t>
-      </w:r>
-      <w:r>
-        <w:rPr>
-          <w:lang w:val="el-GR"/>
-        </w:rPr>
-        <w:t>}</w:t>
-      </w:r>
-      <w:r>
-        <w:rPr>
-          <w:lang w:val="el-GR"/>
-        </w:rPr>
-        <w:t>}</w:t>
-      </w:r>
-    </w:p>
-    <w:p>
-      <w:pPr>
-        <w:rPr>
-          <w:lang w:val="el-GR"/>
-        </w:rPr>
-      </w:pPr>
-      <w:r>
-        <w:rPr>
-          <w:lang w:val="el-GR"/>
-        </w:rPr>
-        <w:t>Αριθμός: {</w:t>
-      </w:r>
-      <w:r>
-        <w:rPr>
-          <w:lang w:val="el-GR"/>
-        </w:rPr>
-        <w:t>{</w:t>
-      </w:r>
-      <w:r>
-        <w:rPr>
-          <w:lang w:val="el-GR"/>
-        </w:rPr>
-        <w:t xml:space="preserve"> </w:t>
-      </w:r>
-      <w:r>
-        <w:rPr>
-          <w:lang w:val="el-GR"/>
-        </w:rPr>
-        <w:t>αριθμό</w:t>
-      </w:r>
-      <w:r>
-        <w:rPr>
-          <w:lang w:val="el-GR"/>
-        </w:rPr>
-        <w:t xml:space="preserve"> </w:t>
-      </w:r>
-      <w:r>
-        <w:rPr>
-          <w:lang w:val="el-GR"/>
-        </w:rPr>
-        <w:t>}</w:t>
-      </w:r>
-      <w:r>
-        <w:rPr>
-          <w:lang w:val="el-GR"/>
-        </w:rPr>
-        <w:t>}</w:t>
-      </w:r>
-    </w:p>
-    <w:p>
-      <w:pPr>
-        <w:rPr>
-          <w:lang w:val="el-GR"/>
-        </w:rPr>
-      </w:pPr>
-      <w:r>
-        <w:rPr>
-          <w:lang w:val="el-GR"/>
-        </w:rPr>
-        <w:t>Τ.Κ: {</w:t>
-      </w:r>
-      <w:r>
-        <w:rPr>
-          <w:lang w:val="el-GR"/>
-        </w:rPr>
-        <w:t>{</w:t>
-      </w:r>
-      <w:r>
-        <w:rPr>
-          <w:lang w:val="el-GR"/>
-        </w:rPr>
-        <w:t xml:space="preserve"> </w:t>
-      </w:r>
-      <w:proofErr w:type="spellStart"/>
-      <w:r>
-        <w:rPr>
-          <w:lang w:val="el-GR"/>
-        </w:rPr>
-        <w:t>ταχυδρομικό</w:t>
-      </w:r>
-      <w:r>
-        <w:rPr>
-          <w:lang w:val="el-GR"/>
-        </w:rPr>
-        <w:t>_</w:t>
-      </w:r>
-      <w:r>
-        <w:rPr>
-          <w:lang w:val="el-GR"/>
-        </w:rPr>
-        <w:t>κώδικα</w:t>
-      </w:r>
-      <w:proofErr w:type="spellEnd"/>
-      <w:r>
-        <w:rPr>
-          <w:lang w:val="el-GR"/>
-        </w:rPr>
-        <w:t xml:space="preserve"> </w:t>
-      </w:r>
-      <w:r>
-        <w:rPr>
-          <w:lang w:val="el-GR"/>
-        </w:rPr>
-        <w:t>}</w:t>
-      </w:r>
-      <w:r>
-        <w:rPr>
-          <w:lang w:val="el-GR"/>
-        </w:rPr>
-        <w:t>}</w:t>
-      </w:r>
-    </w:p>
-    <w:p>
-      <w:pPr>
-        <w:rPr>
-          <w:lang w:val="el-GR"/>
-        </w:rPr>
-      </w:pPr>
-      <w:r>
-        <w:rPr>
-          <w:lang w:val="el-GR"/>
-        </w:rPr>
-        <w:t>Πόλη: {</w:t>
-      </w:r>
-      <w:r>
-        <w:rPr>
-          <w:lang w:val="el-GR"/>
-        </w:rPr>
-        <w:t>{</w:t>
-      </w:r>
-      <w:r>
-        <w:rPr>
-          <w:lang w:val="el-GR"/>
-        </w:rPr>
-        <w:t xml:space="preserve"> </w:t>
-      </w:r>
-      <w:r>
-        <w:rPr>
-          <w:lang w:val="el-GR"/>
-        </w:rPr>
-        <w:t>πόλη</w:t>
-      </w:r>
-      <w:r>
-        <w:rPr>
-          <w:lang w:val="el-GR"/>
-        </w:rPr>
-        <w:t xml:space="preserve"> </w:t>
-      </w:r>
-      <w:r>
-        <w:rPr>
-          <w:lang w:val="el-GR"/>
-        </w:rPr>
-        <w:t>}</w:t>
-      </w:r>
-      <w:r>
-        <w:rPr>
-          <w:lang w:val="el-GR"/>
-        </w:rPr>
-        <w:t>}</w:t>
-      </w:r>
-    </w:p>
-    <w:p>
-      <w:pPr>
-        <w:rPr>
-          <w:lang w:val="el-GR"/>
-        </w:rPr>
-      </w:pPr>
-      <w:r>
-        <w:rPr>
-          <w:lang w:val="el-GR"/>
-        </w:rPr>
-        <w:t>Τηλέφωνο: {</w:t>
-      </w:r>
-      <w:r>
-        <w:rPr>
-          <w:lang w:val="el-GR"/>
-        </w:rPr>
-        <w:t>{</w:t>
-      </w:r>
-      <w:r>
-        <w:rPr>
-          <w:lang w:val="el-GR"/>
-        </w:rPr>
-        <w:t xml:space="preserve"> </w:t>
-      </w:r>
-      <w:r>
-        <w:rPr>
-          <w:lang w:val="el-GR"/>
-        </w:rPr>
-        <w:t>τηλέφωνο</w:t>
-      </w:r>
-      <w:r>
-        <w:rPr>
-          <w:lang w:val="el-GR"/>
-        </w:rPr>
-        <w:t xml:space="preserve"> </w:t>
-      </w:r>
-      <w:r>
-        <w:rPr>
-          <w:lang w:val="el-GR"/>
-        </w:rPr>
-        <w:t>}</w:t>
-      </w:r>
-      <w:r>
-        <w:rPr>
-          <w:lang w:val="el-GR"/>
-        </w:rPr>
-        <w:t>}</w:t>
-      </w:r>
-    </w:p>
-    <w:p>
-      <w:pPr>
-        <w:rPr>
-          <w:lang w:val="el-GR"/>
-        </w:rPr>
-      </w:pPr>
-      <w:r>
-        <w:rPr>
-          <w:lang w:val="el-GR"/>
-        </w:rPr>
-        <w:t xml:space="preserve">Κινητό: </w:t>
-      </w:r>
-      <w:r>
-        <w:rPr>
-          <w:lang w:val="el-GR"/>
-        </w:rPr>
-        <w:t>{</w:t>
-      </w:r>
-      <w:r>
-        <w:rPr>
-          <w:lang w:val="el-GR"/>
-        </w:rPr>
-        <w:t>{</w:t>
-      </w:r>
-      <w:r>
-        <w:rPr>
-          <w:lang w:val="el-GR"/>
-        </w:rPr>
-        <w:t xml:space="preserve"> </w:t>
-      </w:r>
-      <w:r>
-        <w:rPr>
-          <w:lang w:val="el-GR"/>
-        </w:rPr>
-        <w:t>κινητό</w:t>
-      </w:r>
-      <w:r>
-        <w:rPr>
-          <w:lang w:val="el-GR"/>
-        </w:rPr>
-        <w:t xml:space="preserve"> </w:t>
-      </w:r>
-      <w:r>
-        <w:rPr>
-          <w:lang w:val="el-GR"/>
-        </w:rPr>
-        <w:t>}</w:t>
-      </w:r>
-      <w:r>
-        <w:rPr>
-          <w:lang w:val="el-GR"/>
-        </w:rPr>
-        <w:t>}</w:t>
-      </w:r>
-    </w:p>
-    <w:p>
-      <w:pPr>
-        <w:rPr>
-          <w:lang w:val="el-GR"/>
-        </w:rPr>
-      </w:pPr>
-    </w:p>
-    <w:p>
-      <w:pPr>
-        <w:rPr>
-          <w:lang w:val="el-GR"/>
-        </w:rPr>
-      </w:pPr>
-      <w:r>
-        <w:rPr>
-          <w:lang w:val="el-GR"/>
-        </w:rPr>
-        <w:t>Λαμία {</w:t>
-      </w:r>
-      <w:r>
-        <w:rPr>
-          <w:lang w:val="el-GR"/>
-        </w:rPr>
-        <w:t>{</w:t>
-      </w:r>
-      <w:r>
-        <w:rPr>
-          <w:lang w:val="el-GR"/>
-        </w:rPr>
-        <w:t xml:space="preserve"> </w:t>
-      </w:r>
-      <w:r>
-        <w:rPr>
-          <w:lang w:val="el-GR"/>
-        </w:rPr>
-        <w:t>ημέρα</w:t>
-      </w:r>
-      <w:r>
-        <w:rPr>
-          <w:lang w:val="el-GR"/>
-        </w:rPr>
-        <w:t xml:space="preserve"> </w:t>
-      </w:r>
-      <w:r>
-        <w:rPr>
-          <w:lang w:val="el-GR"/>
-        </w:rPr>
-        <w:t>}</w:t>
-      </w:r>
-      <w:r>
-        <w:rPr>
-          <w:lang w:val="el-GR"/>
-        </w:rPr>
-        <w:t>}/{</w:t>
-      </w:r>
-      <w:r>
-        <w:rPr>
-          <w:lang w:val="el-GR"/>
-        </w:rPr>
-        <w:t>{</w:t>
-      </w:r>
-      <w:r>
-        <w:rPr>
-          <w:lang w:val="el-GR"/>
-        </w:rPr>
-        <w:t xml:space="preserve"> </w:t>
-      </w:r>
-      <w:r>
-        <w:rPr>
-          <w:lang w:val="el-GR"/>
-        </w:rPr>
-        <w:t>μήνα</w:t>
-      </w:r>
-      <w:r>
-        <w:rPr>
-          <w:lang w:val="el-GR"/>
-        </w:rPr>
-        <w:t xml:space="preserve"> </w:t>
-      </w:r>
-      <w:r>
-        <w:rPr>
-          <w:lang w:val="el-GR"/>
-        </w:rPr>
-        <w:t>}</w:t>
-      </w:r>
-      <w:r>
-        <w:rPr>
-          <w:lang w:val="el-GR"/>
-        </w:rPr>
-        <w:t>}/{</w:t>
-      </w:r>
-      <w:r>
-        <w:rPr>
-          <w:lang w:val="el-GR"/>
-        </w:rPr>
-        <w:t>{</w:t>
-      </w:r>
-      <w:r>
-        <w:rPr>
-          <w:lang w:val="el-GR"/>
-        </w:rPr>
-        <w:t xml:space="preserve"> </w:t>
-      </w:r>
-      <w:r>
-        <w:rPr>
-          <w:lang w:val="el-GR"/>
-        </w:rPr>
-        <w:t>έτος</w:t>
-      </w:r>
-      <w:r>
-        <w:rPr>
-          <w:lang w:val="el-GR"/>
-        </w:rPr>
-        <w:t xml:space="preserve"> </w:t>
+          <w:lang w:val="en-US"/>
+        </w:rPr>
+        <w:t>year</w:t>
       </w:r>
       <w:r>
         <w:rPr>
@@ -1024,61 +835,59 @@
         </w:rPr>
         <w:t>{</w:t>
       </w:r>
-      <w:r>
-        <w:rPr>
-          <w:lang w:val="el-GR"/>
-        </w:rPr>
-        <w:t xml:space="preserve"> </w:t>
-      </w:r>
       <w:proofErr w:type="spellStart"/>
       <w:r>
         <w:rPr>
-          <w:lang w:val="el-GR"/>
-        </w:rPr>
-        <w:t>β</w:t>
-      </w:r>
-      <w:r>
-        <w:rPr>
-          <w:lang w:val="el-GR"/>
-        </w:rPr>
-        <w:t>εβαίωση</w:t>
-      </w:r>
-      <w:r>
-        <w:rPr>
-          <w:lang w:val="el-GR"/>
-        </w:rPr>
-        <w:t>_</w:t>
-      </w:r>
-      <w:r>
-        <w:rPr>
-          <w:lang w:val="el-GR"/>
-        </w:rPr>
-        <w:t>σ</w:t>
-      </w:r>
-      <w:r>
-        <w:rPr>
-          <w:lang w:val="el-GR"/>
-        </w:rPr>
-        <w:t>πουδών</w:t>
+          <w:lang w:val="en-US"/>
+        </w:rPr>
+        <w:t>what_need</w:t>
       </w:r>
       <w:proofErr w:type="spellEnd"/>
       <w:r>
         <w:rPr>
           <w:lang w:val="el-GR"/>
         </w:rPr>
-        <w:t xml:space="preserve"> </w:t>
-      </w:r>
-      <w:r>
-        <w:rPr>
-          <w:lang w:val="el-GR"/>
-        </w:rPr>
-        <w:t>}</w:t>
-      </w:r>
-      <w:r>
-        <w:rPr>
-          <w:lang w:val="el-GR"/>
-        </w:rPr>
-        <w:t>}</w:t>
+        <w:t>}</w:t>
+      </w:r>
+      <w:r>
+        <w:rPr>
+          <w:lang w:val="el-GR"/>
+        </w:rPr>
+        <w:t>}</w:t>
+      </w:r>
+    </w:p>
+    <w:p>
+      <w:pPr>
+        <w:rPr>
+          <w:lang w:val="en-US"/>
+        </w:rPr>
+      </w:pPr>
+    </w:p>
+    <w:p>
+      <w:pPr>
+        <w:rPr>
+          <w:lang w:val="en-US"/>
+        </w:rPr>
+      </w:pPr>
+    </w:p>
+    <w:p>
+      <w:pPr>
+        <w:rPr>
+          <w:lang w:val="en-US"/>
+        </w:rPr>
+      </w:pPr>
+    </w:p>
+    <w:p>
+      <w:pPr>
+        <w:rPr>
+          <w:lang w:val="el-GR"/>
+        </w:rPr>
+      </w:pPr>
+      <w:r>
+        <w:rPr>
+          <w:lang w:val="el-GR"/>
+        </w:rPr>
+        <w:t>Για να το χρησιμοποιήσω για:</w:t>
       </w:r>
     </w:p>
     <w:p>
@@ -1099,341 +908,45 @@
         </w:rPr>
         <w:t>{</w:t>
       </w:r>
-      <w:r>
-        <w:rPr>
-          <w:lang w:val="el-GR"/>
-        </w:rPr>
-        <w:t xml:space="preserve"> </w:t>
-      </w:r>
       <w:proofErr w:type="spellStart"/>
       <w:r>
         <w:rPr>
-          <w:lang w:val="el-GR"/>
-        </w:rPr>
-        <w:t>α</w:t>
-      </w:r>
-      <w:r>
-        <w:rPr>
-          <w:lang w:val="el-GR"/>
-        </w:rPr>
-        <w:t>ναλυτική</w:t>
-      </w:r>
-      <w:r>
-        <w:rPr>
-          <w:lang w:val="el-GR"/>
-        </w:rPr>
-        <w:t>_</w:t>
-      </w:r>
-      <w:r>
-        <w:rPr>
-          <w:lang w:val="el-GR"/>
-        </w:rPr>
-        <w:t>β</w:t>
-      </w:r>
-      <w:r>
-        <w:rPr>
-          <w:lang w:val="el-GR"/>
-        </w:rPr>
-        <w:t>αθμολογία</w:t>
+          <w:lang w:val="en-US"/>
+        </w:rPr>
+        <w:t>what_for</w:t>
       </w:r>
       <w:proofErr w:type="spellEnd"/>
       <w:r>
         <w:rPr>
           <w:lang w:val="el-GR"/>
         </w:rPr>
-        <w:t xml:space="preserve"> </w:t>
-      </w:r>
-      <w:r>
-        <w:rPr>
-          <w:lang w:val="el-GR"/>
-        </w:rPr>
-        <w:t>}</w:t>
-      </w:r>
-      <w:r>
-        <w:rPr>
-          <w:lang w:val="el-GR"/>
-        </w:rPr>
-        <w:t>}</w:t>
-      </w:r>
-    </w:p>
-    <w:p>
-      <w:pPr>
-        <w:rPr>
-          <w:lang w:val="el-GR"/>
-        </w:rPr>
-      </w:pPr>
-      <w:r>
-        <w:rPr>
-          <w:lang w:val="el-GR"/>
-        </w:rPr>
-        <w:t>{</w:t>
-      </w:r>
-      <w:r>
-        <w:rPr>
-          <w:lang w:val="el-GR"/>
-        </w:rPr>
-        <w:t>{</w:t>
-      </w:r>
-      <w:r>
-        <w:rPr>
-          <w:lang w:val="el-GR"/>
-        </w:rPr>
-        <w:t xml:space="preserve"> </w:t>
-      </w:r>
-      <w:proofErr w:type="spellStart"/>
-      <w:r>
-        <w:rPr>
-          <w:lang w:val="el-GR"/>
-        </w:rPr>
-        <w:t>κάτι</w:t>
-      </w:r>
-      <w:r>
-        <w:rPr>
-          <w:lang w:val="el-GR"/>
-        </w:rPr>
-        <w:t>_</w:t>
-      </w:r>
-      <w:r>
-        <w:rPr>
-          <w:lang w:val="el-GR"/>
-        </w:rPr>
-        <w:t>ά</w:t>
-      </w:r>
-      <w:r>
-        <w:rPr>
-          <w:lang w:val="el-GR"/>
-        </w:rPr>
-        <w:t>λλο</w:t>
-      </w:r>
-      <w:proofErr w:type="spellEnd"/>
-      <w:r>
-        <w:rPr>
-          <w:lang w:val="el-GR"/>
-        </w:rPr>
-        <w:t xml:space="preserve"> </w:t>
-      </w:r>
-      <w:r>
-        <w:rPr>
-          <w:lang w:val="el-GR"/>
-        </w:rPr>
-        <w:t>}</w:t>
-      </w:r>
-      <w:r>
-        <w:rPr>
-          <w:lang w:val="el-GR"/>
-        </w:rPr>
-        <w:t>}</w:t>
-      </w:r>
-    </w:p>
-    <w:p>
-      <w:pPr>
-        <w:rPr>
-          <w:lang w:val="el-GR"/>
-        </w:rPr>
-      </w:pPr>
-    </w:p>
-    <w:p>
-      <w:pPr>
-        <w:rPr>
-          <w:lang w:val="el-GR"/>
-        </w:rPr>
-      </w:pPr>
-      <w:r>
-        <w:rPr>
-          <w:lang w:val="el-GR"/>
-        </w:rPr>
-        <w:t>Για να το χρησιμοποιήσω για:</w:t>
-      </w:r>
-    </w:p>
-    <w:p>
-      <w:pPr>
-        <w:rPr>
-          <w:lang w:val="el-GR"/>
-        </w:rPr>
-      </w:pPr>
-      <w:r>
-        <w:rPr>
-          <w:lang w:val="el-GR"/>
-        </w:rPr>
-        <w:t>{</w:t>
-      </w:r>
-      <w:r>
-        <w:rPr>
-          <w:lang w:val="el-GR"/>
-        </w:rPr>
-        <w:t>{</w:t>
-      </w:r>
-      <w:r>
-        <w:rPr>
-          <w:lang w:val="el-GR"/>
-        </w:rPr>
-        <w:t xml:space="preserve"> </w:t>
-      </w:r>
-      <w:proofErr w:type="spellStart"/>
-      <w:r>
-        <w:rPr>
-          <w:lang w:val="el-GR"/>
-        </w:rPr>
-        <w:t>κ</w:t>
-      </w:r>
-      <w:r>
-        <w:rPr>
-          <w:lang w:val="el-GR"/>
-        </w:rPr>
-        <w:t>άθε</w:t>
-      </w:r>
-      <w:r>
-        <w:rPr>
-          <w:lang w:val="el-GR"/>
-        </w:rPr>
-        <w:t>_</w:t>
-      </w:r>
-      <w:r>
-        <w:rPr>
-          <w:lang w:val="el-GR"/>
-        </w:rPr>
-        <w:t>χ</w:t>
-      </w:r>
-      <w:r>
-        <w:rPr>
-          <w:lang w:val="el-GR"/>
-        </w:rPr>
-        <w:t>ρήση</w:t>
-      </w:r>
-      <w:proofErr w:type="spellEnd"/>
-      <w:r>
-        <w:rPr>
-          <w:lang w:val="el-GR"/>
-        </w:rPr>
-        <w:t xml:space="preserve"> </w:t>
-      </w:r>
-      <w:r>
-        <w:rPr>
-          <w:lang w:val="el-GR"/>
-        </w:rPr>
-        <w:t>}</w:t>
-      </w:r>
-      <w:r>
-        <w:rPr>
-          <w:lang w:val="el-GR"/>
-        </w:rPr>
-        <w:t>}</w:t>
-      </w:r>
-    </w:p>
-    <w:p>
-      <w:pPr>
-        <w:rPr>
-          <w:lang w:val="el-GR"/>
-        </w:rPr>
-      </w:pPr>
-      <w:r>
-        <w:rPr>
-          <w:lang w:val="el-GR"/>
-        </w:rPr>
-        <w:t>{</w:t>
-      </w:r>
-      <w:r>
-        <w:rPr>
-          <w:lang w:val="el-GR"/>
-        </w:rPr>
-        <w:t>{</w:t>
-      </w:r>
-      <w:r>
-        <w:rPr>
-          <w:lang w:val="el-GR"/>
-        </w:rPr>
-        <w:t xml:space="preserve"> </w:t>
-      </w:r>
-      <w:r>
-        <w:rPr>
-          <w:lang w:val="el-GR"/>
-        </w:rPr>
-        <w:t>ε</w:t>
-      </w:r>
-      <w:r>
-        <w:rPr>
-          <w:lang w:val="el-GR"/>
-        </w:rPr>
-        <w:t>φορία</w:t>
-      </w:r>
-      <w:r>
-        <w:rPr>
-          <w:lang w:val="el-GR"/>
-        </w:rPr>
-        <w:t xml:space="preserve"> </w:t>
-      </w:r>
-      <w:r>
-        <w:rPr>
-          <w:lang w:val="el-GR"/>
-        </w:rPr>
-        <w:t>}</w:t>
-      </w:r>
-      <w:r>
-        <w:rPr>
-          <w:lang w:val="el-GR"/>
-        </w:rPr>
-        <w:t>}</w:t>
-      </w:r>
-    </w:p>
-    <w:p>
-      <w:pPr>
-        <w:rPr>
-          <w:lang w:val="el-GR"/>
-        </w:rPr>
-      </w:pPr>
-      <w:r>
-        <w:rPr>
-          <w:lang w:val="el-GR"/>
-        </w:rPr>
-        <w:t>{</w:t>
-      </w:r>
-      <w:r>
-        <w:rPr>
-          <w:lang w:val="el-GR"/>
-        </w:rPr>
-        <w:t>{</w:t>
-      </w:r>
-      <w:r>
-        <w:rPr>
-          <w:lang w:val="el-GR"/>
-        </w:rPr>
-        <w:t xml:space="preserve"> </w:t>
-      </w:r>
-      <w:r>
-        <w:rPr>
-          <w:lang w:val="el-GR"/>
-        </w:rPr>
-        <w:t>σ</w:t>
-      </w:r>
-      <w:r>
-        <w:rPr>
-          <w:lang w:val="el-GR"/>
-        </w:rPr>
-        <w:t>τρατολογία</w:t>
-      </w:r>
-      <w:r>
-        <w:rPr>
-          <w:lang w:val="el-GR"/>
-        </w:rPr>
-        <w:t xml:space="preserve"> </w:t>
-      </w:r>
-      <w:r>
-        <w:rPr>
-          <w:lang w:val="el-GR"/>
-        </w:rPr>
-        <w:t>}</w:t>
-      </w:r>
-      <w:r>
-        <w:rPr>
-          <w:lang w:val="el-GR"/>
-        </w:rPr>
-        <w:t>}</w:t>
-      </w:r>
-    </w:p>
-    <w:p>
-      <w:pPr>
-        <w:rPr>
-          <w:lang w:val="el-GR"/>
+        <w:t>}</w:t>
+      </w:r>
+      <w:r>
+        <w:rPr>
+          <w:lang w:val="el-GR"/>
+        </w:rPr>
+        <w:t>}</w:t>
+      </w:r>
+    </w:p>
+    <w:p>
+      <w:pPr>
+        <w:rPr>
+          <w:lang w:val="en-US"/>
+        </w:rPr>
+      </w:pPr>
+    </w:p>
+    <w:p>
+      <w:pPr>
+        <w:rPr>
+          <w:lang w:val="en-US"/>
+        </w:rPr>
+      </w:pPr>
+    </w:p>
+    <w:p>
+      <w:pPr>
+        <w:rPr>
+          <w:lang w:val="en-US"/>
         </w:rPr>
       </w:pPr>
     </w:p>

</xml_diff>